<commit_message>
Fix TOC: replace Word field with static visual table of contents
</commit_message>
<xml_diff>
--- a/reports/MiniProject_When_ML_Fails_SECOM_BANGOH_DANHOUEGNON_KOUYELE.docx
+++ b/reports/MiniProject_When_ML_Fails_SECOM_BANGOH_DANHOUEGNON_KOUYELE.docx
@@ -211,7 +211,7 @@
         <w:pBdr>
           <w:bottom w:val="single" w:sz="12" w:space="1" w:color="2E75B6"/>
         </w:pBdr>
-        <w:spacing w:before="80" w:after="240"/>
+        <w:spacing w:before="80" w:after="280"/>
       </w:pPr>
       <w:r>
         <w:rPr>
@@ -224,26 +224,414 @@
       </w:r>
     </w:p>
     <w:p>
+      <w:pPr>
+        <w:spacing w:before="160" w:after="40"/>
+      </w:pPr>
       <w:r>
-        <w:fldChar w:fldCharType="begin"/>
-        <w:instrText xml:space="preserve">TOC \o "1-2" \h \z \u</w:instrText>
-        <w:fldChar w:fldCharType="separate"/>
-        <w:fldChar w:fldCharType="end"/>
+        <w:rPr>
+          <w:rFonts w:ascii="Calibri" w:hAnsi="Calibri"/>
+          <w:b/>
+          <w:i w:val="0"/>
+          <w:color w:val="1F497D"/>
+          <w:sz w:val="22"/>
+        </w:rPr>
+        <w:t>1.  Research Question and Chosen Dataset</w:t>
       </w:r>
     </w:p>
     <w:p>
       <w:pPr>
-        <w:spacing w:after="80" w:before="40"/>
+        <w:spacing w:before="20" w:after="20"/>
+        <w:ind w:left="510"/>
       </w:pPr>
       <w:r>
         <w:rPr>
           <w:rFonts w:ascii="Calibri" w:hAnsi="Calibri"/>
           <w:b w:val="0"/>
+          <w:i w:val="0"/>
+          <w:color w:val="2E75B6"/>
+          <w:sz w:val="20"/>
+        </w:rPr>
+        <w:t>▸  Dataset and Preprocessing</w:t>
+      </w:r>
+    </w:p>
+    <w:p>
+      <w:pPr>
+        <w:spacing w:before="160" w:after="40"/>
+      </w:pPr>
+      <w:r>
+        <w:rPr>
+          <w:rFonts w:ascii="Calibri" w:hAnsi="Calibri"/>
+          <w:b/>
+          <w:i w:val="0"/>
+          <w:color w:val="1F497D"/>
+          <w:sz w:val="22"/>
+        </w:rPr>
+        <w:t>2.  Reference Model and Observed Symptom</w:t>
+      </w:r>
+    </w:p>
+    <w:p>
+      <w:pPr>
+        <w:spacing w:before="20" w:after="20"/>
+        <w:ind w:left="510"/>
+      </w:pPr>
+      <w:r>
+        <w:rPr>
+          <w:rFonts w:ascii="Calibri" w:hAnsi="Calibri"/>
+          <w:b w:val="0"/>
+          <w:i w:val="0"/>
+          <w:color w:val="2E75B6"/>
+          <w:sz w:val="20"/>
+        </w:rPr>
+        <w:t>▸  Observed Symptom</w:t>
+      </w:r>
+    </w:p>
+    <w:p>
+      <w:pPr>
+        <w:spacing w:before="160" w:after="40"/>
+      </w:pPr>
+      <w:r>
+        <w:rPr>
+          <w:rFonts w:ascii="Calibri" w:hAnsi="Calibri"/>
+          <w:b/>
+          <w:i w:val="0"/>
+          <w:color w:val="1F497D"/>
+          <w:sz w:val="22"/>
+        </w:rPr>
+        <w:t>3.  Causal Hypothesis and Controlled Experiment</w:t>
+      </w:r>
+    </w:p>
+    <w:p>
+      <w:pPr>
+        <w:spacing w:before="20" w:after="20"/>
+        <w:ind w:left="510"/>
+      </w:pPr>
+      <w:r>
+        <w:rPr>
+          <w:rFonts w:ascii="Calibri" w:hAnsi="Calibri"/>
+          <w:b w:val="0"/>
+          <w:i w:val="0"/>
+          <w:color w:val="2E75B6"/>
+          <w:sz w:val="20"/>
+        </w:rPr>
+        <w:t>▸  Causal Hypothesis</w:t>
+      </w:r>
+    </w:p>
+    <w:p>
+      <w:pPr>
+        <w:spacing w:before="20" w:after="20"/>
+        <w:ind w:left="510"/>
+      </w:pPr>
+      <w:r>
+        <w:rPr>
+          <w:rFonts w:ascii="Calibri" w:hAnsi="Calibri"/>
+          <w:b w:val="0"/>
+          <w:i w:val="0"/>
+          <w:color w:val="2E75B6"/>
+          <w:sz w:val="20"/>
+        </w:rPr>
+        <w:t>▸  Controlled Variable: shortcut_alarm</w:t>
+      </w:r>
+    </w:p>
+    <w:p>
+      <w:pPr>
+        <w:spacing w:before="20" w:after="20"/>
+        <w:ind w:left="510"/>
+      </w:pPr>
+      <w:r>
+        <w:rPr>
+          <w:rFonts w:ascii="Calibri" w:hAnsi="Calibri"/>
+          <w:b w:val="0"/>
+          <w:i w:val="0"/>
+          <w:color w:val="2E75B6"/>
+          <w:sz w:val="20"/>
+        </w:rPr>
+        <w:t>▸  Result: ROC-AUC Collapses when Shortcut is Inverted</w:t>
+      </w:r>
+    </w:p>
+    <w:p>
+      <w:pPr>
+        <w:spacing w:before="20" w:after="20"/>
+        <w:ind w:left="510"/>
+      </w:pPr>
+      <w:r>
+        <w:rPr>
+          <w:rFonts w:ascii="Calibri" w:hAnsi="Calibri"/>
+          <w:b w:val="0"/>
+          <w:i w:val="0"/>
+          <w:color w:val="2E75B6"/>
+          <w:sz w:val="20"/>
+        </w:rPr>
+        <w:t>▸  Sensitivity Analysis: Effect Grows with Shortcut Reliability</w:t>
+      </w:r>
+    </w:p>
+    <w:p>
+      <w:pPr>
+        <w:spacing w:before="20" w:after="20"/>
+        <w:ind w:left="510"/>
+      </w:pPr>
+      <w:r>
+        <w:rPr>
+          <w:rFonts w:ascii="Calibri" w:hAnsi="Calibri"/>
+          <w:b w:val="0"/>
+          <w:i w:val="0"/>
+          <w:color w:val="2E75B6"/>
+          <w:sz w:val="20"/>
+        </w:rPr>
+        <w:t>▸  Feature Importance: shortcut_alarm Dominates</w:t>
+      </w:r>
+    </w:p>
+    <w:p>
+      <w:pPr>
+        <w:spacing w:before="160" w:after="40"/>
+      </w:pPr>
+      <w:r>
+        <w:rPr>
+          <w:rFonts w:ascii="Calibri" w:hAnsi="Calibri"/>
+          <w:b/>
+          <w:i w:val="0"/>
+          <w:color w:val="1F497D"/>
+          <w:sz w:val="22"/>
+        </w:rPr>
+        <w:t>4.  Proposed Correction and Evaluation</w:t>
+      </w:r>
+    </w:p>
+    <w:p>
+      <w:pPr>
+        <w:spacing w:before="20" w:after="20"/>
+        <w:ind w:left="510"/>
+      </w:pPr>
+      <w:r>
+        <w:rPr>
+          <w:rFonts w:ascii="Calibri" w:hAnsi="Calibri"/>
+          <w:b w:val="0"/>
+          <w:i w:val="0"/>
+          <w:color w:val="2E75B6"/>
+          <w:sz w:val="20"/>
+        </w:rPr>
+        <w:t>▸  Correction: Remove the Non-Causal Feature</w:t>
+      </w:r>
+    </w:p>
+    <w:p>
+      <w:pPr>
+        <w:spacing w:before="20" w:after="20"/>
+        <w:ind w:left="510"/>
+      </w:pPr>
+      <w:r>
+        <w:rPr>
+          <w:rFonts w:ascii="Calibri" w:hAnsi="Calibri"/>
+          <w:b w:val="0"/>
+          <w:i w:val="0"/>
+          <w:color w:val="2E75B6"/>
+          <w:sz w:val="20"/>
+        </w:rPr>
+        <w:t>▸  Before / After Comparison</w:t>
+      </w:r>
+    </w:p>
+    <w:p>
+      <w:pPr>
+        <w:spacing w:before="160" w:after="40"/>
+      </w:pPr>
+      <w:r>
+        <w:rPr>
+          <w:rFonts w:ascii="Calibri" w:hAnsi="Calibri"/>
+          <w:b/>
+          <w:i w:val="0"/>
+          <w:color w:val="1F497D"/>
+          <w:sz w:val="22"/>
+        </w:rPr>
+        <w:t>5.  Experimental Validation — Variance Across Seeds</w:t>
+      </w:r>
+    </w:p>
+    <w:p>
+      <w:pPr>
+        <w:spacing w:before="160" w:after="40"/>
+      </w:pPr>
+      <w:r>
+        <w:rPr>
+          <w:rFonts w:ascii="Calibri" w:hAnsi="Calibri"/>
+          <w:b/>
+          <w:i w:val="0"/>
+          <w:color w:val="1F497D"/>
+          <w:sz w:val="22"/>
+        </w:rPr>
+        <w:t>6.  Failure Mode A: Class Imbalance Failure</w:t>
+      </w:r>
+      <w:r>
+        <w:rPr>
+          <w:rFonts w:ascii="Calibri" w:hAnsi="Calibri"/>
+          <w:b w:val="0"/>
           <w:i/>
-          <w:color w:val="606060"/>
-          <w:sz w:val="19"/>
+          <w:color w:val="7F6000"/>
+          <w:sz w:val="18"/>
         </w:rPr>
-        <w:t>Right-click on this field → "Update Field" to populate the table of contents.</w:t>
+        <w:t xml:space="preserve">  — BONUS</w:t>
+      </w:r>
+    </w:p>
+    <w:p>
+      <w:pPr>
+        <w:spacing w:before="20" w:after="20"/>
+        <w:ind w:left="510"/>
+      </w:pPr>
+      <w:r>
+        <w:rPr>
+          <w:rFonts w:ascii="Calibri" w:hAnsi="Calibri"/>
+          <w:b w:val="0"/>
+          <w:i w:val="0"/>
+          <w:color w:val="2E75B6"/>
+          <w:sz w:val="20"/>
+        </w:rPr>
+        <w:t>▸  Observed Symptom</w:t>
+      </w:r>
+    </w:p>
+    <w:p>
+      <w:pPr>
+        <w:spacing w:before="20" w:after="20"/>
+        <w:ind w:left="510"/>
+      </w:pPr>
+      <w:r>
+        <w:rPr>
+          <w:rFonts w:ascii="Calibri" w:hAnsi="Calibri"/>
+          <w:b w:val="0"/>
+          <w:i w:val="0"/>
+          <w:color w:val="2E75B6"/>
+          <w:sz w:val="20"/>
+        </w:rPr>
+        <w:t>▸  Causal Hypothesis and Controlled Test</w:t>
+      </w:r>
+    </w:p>
+    <w:p>
+      <w:pPr>
+        <w:spacing w:before="20" w:after="20"/>
+        <w:ind w:left="510"/>
+      </w:pPr>
+      <w:r>
+        <w:rPr>
+          <w:rFonts w:ascii="Calibri" w:hAnsi="Calibri"/>
+          <w:b w:val="0"/>
+          <w:i w:val="0"/>
+          <w:color w:val="2E75B6"/>
+          <w:sz w:val="20"/>
+        </w:rPr>
+        <w:t>▸  Correction: Class Weighting + Threshold Optimisation</w:t>
+      </w:r>
+    </w:p>
+    <w:p>
+      <w:pPr>
+        <w:spacing w:before="160" w:after="40"/>
+      </w:pPr>
+      <w:r>
+        <w:rPr>
+          <w:rFonts w:ascii="Calibri" w:hAnsi="Calibri"/>
+          <w:b/>
+          <w:i w:val="0"/>
+          <w:color w:val="1F497D"/>
+          <w:sz w:val="22"/>
+        </w:rPr>
+        <w:t>7.  Failure Mode B: Distribution Shift Between Industrial Phases</w:t>
+      </w:r>
+      <w:r>
+        <w:rPr>
+          <w:rFonts w:ascii="Calibri" w:hAnsi="Calibri"/>
+          <w:b w:val="0"/>
+          <w:i/>
+          <w:color w:val="7F6000"/>
+          <w:sz w:val="18"/>
+        </w:rPr>
+        <w:t xml:space="preserve">  — BONUS</w:t>
+      </w:r>
+    </w:p>
+    <w:p>
+      <w:pPr>
+        <w:spacing w:before="20" w:after="20"/>
+        <w:ind w:left="510"/>
+      </w:pPr>
+      <w:r>
+        <w:rPr>
+          <w:rFonts w:ascii="Calibri" w:hAnsi="Calibri"/>
+          <w:b w:val="0"/>
+          <w:i w:val="0"/>
+          <w:color w:val="2E75B6"/>
+          <w:sz w:val="20"/>
+        </w:rPr>
+        <w:t>▸  Symptom and Hypothesis</w:t>
+      </w:r>
+    </w:p>
+    <w:p>
+      <w:pPr>
+        <w:spacing w:before="20" w:after="20"/>
+        <w:ind w:left="510"/>
+      </w:pPr>
+      <w:r>
+        <w:rPr>
+          <w:rFonts w:ascii="Calibri" w:hAnsi="Calibri"/>
+          <w:b w:val="0"/>
+          <w:i w:val="0"/>
+          <w:color w:val="2E75B6"/>
+          <w:sz w:val="20"/>
+        </w:rPr>
+        <w:t>▸  Controlled Experiment</w:t>
+      </w:r>
+    </w:p>
+    <w:p>
+      <w:pPr>
+        <w:spacing w:before="160" w:after="40"/>
+      </w:pPr>
+      <w:r>
+        <w:rPr>
+          <w:rFonts w:ascii="Calibri" w:hAnsi="Calibri"/>
+          <w:b/>
+          <w:i w:val="0"/>
+          <w:color w:val="1F497D"/>
+          <w:sz w:val="22"/>
+        </w:rPr>
+        <w:t>8.  Threats to Validity</w:t>
+      </w:r>
+    </w:p>
+    <w:p>
+      <w:pPr>
+        <w:spacing w:before="160" w:after="40"/>
+      </w:pPr>
+      <w:r>
+        <w:rPr>
+          <w:rFonts w:ascii="Calibri" w:hAnsi="Calibri"/>
+          <w:b/>
+          <w:i w:val="0"/>
+          <w:color w:val="1F497D"/>
+          <w:sz w:val="22"/>
+        </w:rPr>
+        <w:t>9.  Conclusion and What We Learned</w:t>
+      </w:r>
+    </w:p>
+    <w:p>
+      <w:pPr>
+        <w:spacing w:before="20" w:after="20"/>
+        <w:ind w:left="510"/>
+      </w:pPr>
+      <w:r>
+        <w:rPr>
+          <w:rFonts w:ascii="Calibri" w:hAnsi="Calibri"/>
+          <w:b w:val="0"/>
+          <w:i w:val="0"/>
+          <w:color w:val="2E75B6"/>
+          <w:sz w:val="20"/>
+        </w:rPr>
+        <w:t>▸  Main Findings</w:t>
+      </w:r>
+    </w:p>
+    <w:p>
+      <w:pPr>
+        <w:spacing w:before="20" w:after="20"/>
+        <w:ind w:left="510"/>
+      </w:pPr>
+      <w:r>
+        <w:rPr>
+          <w:rFonts w:ascii="Calibri" w:hAnsi="Calibri"/>
+          <w:b w:val="0"/>
+          <w:i w:val="0"/>
+          <w:color w:val="2E75B6"/>
+          <w:sz w:val="20"/>
+        </w:rPr>
+        <w:t>▸  What We Learned</w:t>
       </w:r>
     </w:p>
     <w:p>

</xml_diff>